<commit_message>
Changed some items in the text.
</commit_message>
<xml_diff>
--- a/Nemacki_podsetnik.docx
+++ b/Nemacki_podsetnik.docx
@@ -12780,6 +12780,24 @@
       <w:pPr>
         <w:pStyle w:val="NoSpacing"/>
         <w:rPr>
+          <w:b/>
+          <w:bCs/>
+          <w:lang w:val="de-DE"/>
+        </w:rPr>
+      </w:pPr>
+      <w:r>
+        <w:rPr>
+          <w:b/>
+          <w:bCs/>
+          <w:lang w:val="de-DE"/>
+        </w:rPr>
+        <w:t>lachend – smejući</w:t>
+      </w:r>
+    </w:p>
+    <w:p>
+      <w:pPr>
+        <w:pStyle w:val="NoSpacing"/>
+        <w:rPr>
           <w:lang w:val="de-DE"/>
         </w:rPr>
       </w:pPr>
@@ -12793,38 +12811,6 @@
         <w:rPr>
           <w:lang w:val="de-DE"/>
         </w:rPr>
-        <w:t>achend – smeju</w:t>
-      </w:r>
-      <w:r>
-        <w:rPr>
-          <w:lang w:val="de-DE"/>
-        </w:rPr>
-        <w:t>ć</w:t>
-      </w:r>
-      <w:r>
-        <w:rPr>
-          <w:lang w:val="de-DE"/>
-        </w:rPr>
-        <w:t>i</w:t>
-      </w:r>
-    </w:p>
-    <w:p>
-      <w:pPr>
-        <w:pStyle w:val="NoSpacing"/>
-        <w:rPr>
-          <w:lang w:val="de-DE"/>
-        </w:rPr>
-      </w:pPr>
-      <w:r>
-        <w:rPr>
-          <w:lang w:val="de-DE"/>
-        </w:rPr>
-        <w:t>l</w:t>
-      </w:r>
-      <w:r>
-        <w:rPr>
-          <w:lang w:val="de-DE"/>
-        </w:rPr>
         <w:t>aufen (tr</w:t>
       </w:r>
       <w:r>
@@ -12844,11 +12830,15 @@
       <w:pPr>
         <w:pStyle w:val="NoSpacing"/>
         <w:rPr>
-          <w:lang w:val="de-DE"/>
-        </w:rPr>
-      </w:pPr>
-      <w:r>
-        <w:rPr>
+          <w:b/>
+          <w:bCs/>
+          <w:lang w:val="de-DE"/>
+        </w:rPr>
+      </w:pPr>
+      <w:r>
+        <w:rPr>
+          <w:b/>
+          <w:bCs/>
           <w:lang w:val="de-DE"/>
         </w:rPr>
         <w:t>laufend (trčeći)</w:t>
@@ -12872,11 +12862,15 @@
       <w:pPr>
         <w:pStyle w:val="NoSpacing"/>
         <w:rPr>
-          <w:lang w:val="de-DE"/>
-        </w:rPr>
-      </w:pPr>
-      <w:r>
-        <w:rPr>
+          <w:b/>
+          <w:bCs/>
+          <w:lang w:val="de-DE"/>
+        </w:rPr>
+      </w:pPr>
+      <w:r>
+        <w:rPr>
+          <w:b/>
+          <w:bCs/>
           <w:lang w:val="de-DE"/>
         </w:rPr>
         <w:t>singend (pevajući)</w:t>
@@ -22035,12 +22029,14 @@
         <w:rPr>
           <w:b/>
           <w:bCs/>
-        </w:rPr>
-      </w:pPr>
-      <w:r>
-        <w:rPr>
-          <w:b/>
-          <w:bCs/>
+          <w:lang w:val="de-DE"/>
+        </w:rPr>
+      </w:pPr>
+      <w:r>
+        <w:rPr>
+          <w:b/>
+          <w:bCs/>
+          <w:lang w:val="de-DE"/>
         </w:rPr>
         <w:t xml:space="preserve">Na primer: </w:t>
       </w:r>

</xml_diff>

<commit_message>
Enlargment of the table..
</commit_message>
<xml_diff>
--- a/Nemacki_podsetnik.docx
+++ b/Nemacki_podsetnik.docx
@@ -13964,22 +13964,6 @@
     <w:p>
       <w:pPr>
         <w:pStyle w:val="NoSpacing"/>
-        <w:rPr>
-          <w:lang w:val="de-DE"/>
-        </w:rPr>
-      </w:pPr>
-    </w:p>
-    <w:p>
-      <w:pPr>
-        <w:pStyle w:val="NoSpacing"/>
-        <w:rPr>
-          <w:lang w:val="de-DE"/>
-        </w:rPr>
-      </w:pPr>
-    </w:p>
-    <w:p>
-      <w:pPr>
-        <w:pStyle w:val="NoSpacing"/>
         <w:jc w:val="center"/>
         <w:rPr>
           <w:sz w:val="32"/>
@@ -13994,6 +13978,7 @@
           <w:highlight w:val="yellow"/>
           <w:lang w:val="sr-Latn-RS"/>
         </w:rPr>
+        <w:lastRenderedPageBreak/>
         <w:t>Personalpronomen – lične zamenice</w:t>
       </w:r>
     </w:p>
@@ -14043,12 +14028,16 @@
               <w:pStyle w:val="NoSpacing"/>
               <w:rPr>
                 <w:color w:val="385623" w:themeColor="accent6" w:themeShade="80"/>
+                <w:sz w:val="28"/>
+                <w:szCs w:val="28"/>
                 <w:lang w:val="sr-Latn-RS"/>
               </w:rPr>
             </w:pPr>
             <w:r>
               <w:rPr>
                 <w:color w:val="385623" w:themeColor="accent6" w:themeShade="80"/>
+                <w:sz w:val="28"/>
+                <w:szCs w:val="28"/>
                 <w:lang w:val="sr-Latn-RS"/>
               </w:rPr>
               <w:t>Nominativ</w:t>
@@ -14071,12 +14060,16 @@
               <w:pStyle w:val="NoSpacing"/>
               <w:rPr>
                 <w:color w:val="833C0B" w:themeColor="accent2" w:themeShade="80"/>
+                <w:sz w:val="28"/>
+                <w:szCs w:val="28"/>
                 <w:lang w:val="sr-Latn-RS"/>
               </w:rPr>
             </w:pPr>
             <w:r>
               <w:rPr>
                 <w:color w:val="833C0B" w:themeColor="accent2" w:themeShade="80"/>
+                <w:sz w:val="28"/>
+                <w:szCs w:val="28"/>
                 <w:lang w:val="sr-Latn-RS"/>
               </w:rPr>
               <w:t>Genitiv</w:t>
@@ -14099,12 +14092,16 @@
               <w:pStyle w:val="NoSpacing"/>
               <w:rPr>
                 <w:color w:val="C00000"/>
+                <w:sz w:val="28"/>
+                <w:szCs w:val="28"/>
                 <w:lang w:val="sr-Latn-RS"/>
               </w:rPr>
             </w:pPr>
             <w:r>
               <w:rPr>
                 <w:color w:val="C00000"/>
+                <w:sz w:val="28"/>
+                <w:szCs w:val="28"/>
                 <w:lang w:val="sr-Latn-RS"/>
               </w:rPr>
               <w:t>Dativ</w:t>
@@ -14126,11 +14123,15 @@
             <w:pPr>
               <w:pStyle w:val="NoSpacing"/>
               <w:rPr>
-                <w:lang w:val="sr-Latn-RS"/>
-              </w:rPr>
-            </w:pPr>
-            <w:r>
-              <w:rPr>
+                <w:sz w:val="28"/>
+                <w:szCs w:val="28"/>
+                <w:lang w:val="sr-Latn-RS"/>
+              </w:rPr>
+            </w:pPr>
+            <w:r>
+              <w:rPr>
+                <w:sz w:val="28"/>
+                <w:szCs w:val="28"/>
                 <w:lang w:val="sr-Latn-RS"/>
               </w:rPr>
               <w:t>Akkusativ</w:t>
@@ -14155,12 +14156,16 @@
               <w:pStyle w:val="NoSpacing"/>
               <w:rPr>
                 <w:color w:val="385623" w:themeColor="accent6" w:themeShade="80"/>
+                <w:sz w:val="28"/>
+                <w:szCs w:val="28"/>
                 <w:lang w:val="sr-Latn-RS"/>
               </w:rPr>
             </w:pPr>
             <w:r>
               <w:rPr>
                 <w:color w:val="385623" w:themeColor="accent6" w:themeShade="80"/>
+                <w:sz w:val="28"/>
+                <w:szCs w:val="28"/>
                 <w:lang w:val="sr-Latn-RS"/>
               </w:rPr>
               <w:t>ich</w:t>
@@ -14183,12 +14188,16 @@
               <w:pStyle w:val="NoSpacing"/>
               <w:rPr>
                 <w:color w:val="833C0B" w:themeColor="accent2" w:themeShade="80"/>
+                <w:sz w:val="28"/>
+                <w:szCs w:val="28"/>
                 <w:lang w:val="sr-Latn-RS"/>
               </w:rPr>
             </w:pPr>
             <w:r>
               <w:rPr>
                 <w:color w:val="833C0B" w:themeColor="accent2" w:themeShade="80"/>
+                <w:sz w:val="28"/>
+                <w:szCs w:val="28"/>
                 <w:lang w:val="sr-Latn-RS"/>
               </w:rPr>
               <w:t>meiner - moj</w:t>
@@ -14211,12 +14220,16 @@
               <w:pStyle w:val="NoSpacing"/>
               <w:rPr>
                 <w:color w:val="C00000"/>
+                <w:sz w:val="28"/>
+                <w:szCs w:val="28"/>
                 <w:lang w:val="sr-Latn-RS"/>
               </w:rPr>
             </w:pPr>
             <w:r>
               <w:rPr>
                 <w:color w:val="C00000"/>
+                <w:sz w:val="28"/>
+                <w:szCs w:val="28"/>
                 <w:lang w:val="sr-Latn-RS"/>
               </w:rPr>
               <w:t>mir - meni</w:t>
@@ -14238,11 +14251,15 @@
             <w:pPr>
               <w:pStyle w:val="NoSpacing"/>
               <w:rPr>
-                <w:lang w:val="sr-Latn-RS"/>
-              </w:rPr>
-            </w:pPr>
-            <w:r>
-              <w:rPr>
+                <w:sz w:val="28"/>
+                <w:szCs w:val="28"/>
+                <w:lang w:val="sr-Latn-RS"/>
+              </w:rPr>
+            </w:pPr>
+            <w:r>
+              <w:rPr>
+                <w:sz w:val="28"/>
+                <w:szCs w:val="28"/>
                 <w:lang w:val="sr-Latn-RS"/>
               </w:rPr>
               <w:t>mich - mene</w:t>
@@ -14267,12 +14284,16 @@
               <w:pStyle w:val="NoSpacing"/>
               <w:rPr>
                 <w:color w:val="385623" w:themeColor="accent6" w:themeShade="80"/>
+                <w:sz w:val="28"/>
+                <w:szCs w:val="28"/>
                 <w:lang w:val="sr-Latn-RS"/>
               </w:rPr>
             </w:pPr>
             <w:r>
               <w:rPr>
                 <w:color w:val="385623" w:themeColor="accent6" w:themeShade="80"/>
+                <w:sz w:val="28"/>
+                <w:szCs w:val="28"/>
                 <w:lang w:val="sr-Latn-RS"/>
               </w:rPr>
               <w:t>du</w:t>
@@ -14295,12 +14316,16 @@
               <w:pStyle w:val="NoSpacing"/>
               <w:rPr>
                 <w:color w:val="833C0B" w:themeColor="accent2" w:themeShade="80"/>
+                <w:sz w:val="28"/>
+                <w:szCs w:val="28"/>
                 <w:lang w:val="sr-Latn-RS"/>
               </w:rPr>
             </w:pPr>
             <w:r>
               <w:rPr>
                 <w:color w:val="833C0B" w:themeColor="accent2" w:themeShade="80"/>
+                <w:sz w:val="28"/>
+                <w:szCs w:val="28"/>
                 <w:lang w:val="sr-Latn-RS"/>
               </w:rPr>
               <w:t>deiner - tvoj</w:t>
@@ -14323,12 +14348,16 @@
               <w:pStyle w:val="NoSpacing"/>
               <w:rPr>
                 <w:color w:val="C00000"/>
+                <w:sz w:val="28"/>
+                <w:szCs w:val="28"/>
                 <w:lang w:val="sr-Latn-RS"/>
               </w:rPr>
             </w:pPr>
             <w:r>
               <w:rPr>
                 <w:color w:val="C00000"/>
+                <w:sz w:val="28"/>
+                <w:szCs w:val="28"/>
                 <w:lang w:val="sr-Latn-RS"/>
               </w:rPr>
               <w:t>dir - tebi</w:t>
@@ -14350,11 +14379,15 @@
             <w:pPr>
               <w:pStyle w:val="NoSpacing"/>
               <w:rPr>
-                <w:lang w:val="sr-Latn-RS"/>
-              </w:rPr>
-            </w:pPr>
-            <w:r>
-              <w:rPr>
+                <w:sz w:val="28"/>
+                <w:szCs w:val="28"/>
+                <w:lang w:val="sr-Latn-RS"/>
+              </w:rPr>
+            </w:pPr>
+            <w:r>
+              <w:rPr>
+                <w:sz w:val="28"/>
+                <w:szCs w:val="28"/>
                 <w:lang w:val="sr-Latn-RS"/>
               </w:rPr>
               <w:t>dich - tebe</w:t>
@@ -14379,12 +14412,16 @@
               <w:pStyle w:val="NoSpacing"/>
               <w:rPr>
                 <w:color w:val="385623" w:themeColor="accent6" w:themeShade="80"/>
+                <w:sz w:val="28"/>
+                <w:szCs w:val="28"/>
                 <w:lang w:val="sr-Latn-RS"/>
               </w:rPr>
             </w:pPr>
             <w:r>
               <w:rPr>
                 <w:color w:val="385623" w:themeColor="accent6" w:themeShade="80"/>
+                <w:sz w:val="28"/>
+                <w:szCs w:val="28"/>
                 <w:lang w:val="sr-Latn-RS"/>
               </w:rPr>
               <w:t>er</w:t>
@@ -14407,12 +14444,16 @@
               <w:pStyle w:val="NoSpacing"/>
               <w:rPr>
                 <w:color w:val="833C0B" w:themeColor="accent2" w:themeShade="80"/>
+                <w:sz w:val="28"/>
+                <w:szCs w:val="28"/>
                 <w:lang w:val="sr-Latn-RS"/>
               </w:rPr>
             </w:pPr>
             <w:r>
               <w:rPr>
                 <w:color w:val="833C0B" w:themeColor="accent2" w:themeShade="80"/>
+                <w:sz w:val="28"/>
+                <w:szCs w:val="28"/>
                 <w:lang w:val="sr-Latn-RS"/>
               </w:rPr>
               <w:t>seiner - njegov</w:t>
@@ -14435,12 +14476,16 @@
               <w:pStyle w:val="NoSpacing"/>
               <w:rPr>
                 <w:color w:val="C00000"/>
+                <w:sz w:val="28"/>
+                <w:szCs w:val="28"/>
                 <w:lang w:val="sr-Latn-RS"/>
               </w:rPr>
             </w:pPr>
             <w:r>
               <w:rPr>
                 <w:color w:val="C00000"/>
+                <w:sz w:val="28"/>
+                <w:szCs w:val="28"/>
                 <w:lang w:val="sr-Latn-RS"/>
               </w:rPr>
               <w:t>ihm - njemu</w:t>
@@ -14462,11 +14507,15 @@
             <w:pPr>
               <w:pStyle w:val="NoSpacing"/>
               <w:rPr>
-                <w:lang w:val="sr-Latn-RS"/>
-              </w:rPr>
-            </w:pPr>
-            <w:r>
-              <w:rPr>
+                <w:sz w:val="28"/>
+                <w:szCs w:val="28"/>
+                <w:lang w:val="sr-Latn-RS"/>
+              </w:rPr>
+            </w:pPr>
+            <w:r>
+              <w:rPr>
+                <w:sz w:val="28"/>
+                <w:szCs w:val="28"/>
                 <w:lang w:val="sr-Latn-RS"/>
               </w:rPr>
               <w:t>ihn - njega</w:t>
@@ -14491,12 +14540,16 @@
               <w:pStyle w:val="NoSpacing"/>
               <w:rPr>
                 <w:color w:val="385623" w:themeColor="accent6" w:themeShade="80"/>
+                <w:sz w:val="28"/>
+                <w:szCs w:val="28"/>
                 <w:lang w:val="sr-Latn-RS"/>
               </w:rPr>
             </w:pPr>
             <w:r>
               <w:rPr>
                 <w:color w:val="385623" w:themeColor="accent6" w:themeShade="80"/>
+                <w:sz w:val="28"/>
+                <w:szCs w:val="28"/>
                 <w:lang w:val="sr-Latn-RS"/>
               </w:rPr>
               <w:t>sie</w:t>
@@ -14519,12 +14572,16 @@
               <w:pStyle w:val="NoSpacing"/>
               <w:rPr>
                 <w:color w:val="833C0B" w:themeColor="accent2" w:themeShade="80"/>
+                <w:sz w:val="28"/>
+                <w:szCs w:val="28"/>
                 <w:lang w:val="sr-Latn-RS"/>
               </w:rPr>
             </w:pPr>
             <w:r>
               <w:rPr>
                 <w:color w:val="833C0B" w:themeColor="accent2" w:themeShade="80"/>
+                <w:sz w:val="28"/>
+                <w:szCs w:val="28"/>
                 <w:lang w:val="sr-Latn-RS"/>
               </w:rPr>
               <w:t>ihrer - njen</w:t>
@@ -14547,12 +14604,16 @@
               <w:pStyle w:val="NoSpacing"/>
               <w:rPr>
                 <w:color w:val="C00000"/>
+                <w:sz w:val="28"/>
+                <w:szCs w:val="28"/>
                 <w:lang w:val="sr-Latn-RS"/>
               </w:rPr>
             </w:pPr>
             <w:r>
               <w:rPr>
                 <w:color w:val="C00000"/>
+                <w:sz w:val="28"/>
+                <w:szCs w:val="28"/>
                 <w:lang w:val="sr-Latn-RS"/>
               </w:rPr>
               <w:t>ihr - njoj</w:t>
@@ -14574,11 +14635,15 @@
             <w:pPr>
               <w:pStyle w:val="NoSpacing"/>
               <w:rPr>
-                <w:lang w:val="sr-Latn-RS"/>
-              </w:rPr>
-            </w:pPr>
-            <w:r>
-              <w:rPr>
+                <w:sz w:val="28"/>
+                <w:szCs w:val="28"/>
+                <w:lang w:val="sr-Latn-RS"/>
+              </w:rPr>
+            </w:pPr>
+            <w:r>
+              <w:rPr>
+                <w:sz w:val="28"/>
+                <w:szCs w:val="28"/>
                 <w:lang w:val="sr-Latn-RS"/>
               </w:rPr>
               <w:t>sie - nju</w:t>
@@ -14603,12 +14668,16 @@
               <w:pStyle w:val="NoSpacing"/>
               <w:rPr>
                 <w:color w:val="385623" w:themeColor="accent6" w:themeShade="80"/>
+                <w:sz w:val="28"/>
+                <w:szCs w:val="28"/>
                 <w:lang w:val="sr-Latn-RS"/>
               </w:rPr>
             </w:pPr>
             <w:r>
               <w:rPr>
                 <w:color w:val="385623" w:themeColor="accent6" w:themeShade="80"/>
+                <w:sz w:val="28"/>
+                <w:szCs w:val="28"/>
                 <w:lang w:val="sr-Latn-RS"/>
               </w:rPr>
               <w:t>es</w:t>
@@ -14631,12 +14700,16 @@
               <w:pStyle w:val="NoSpacing"/>
               <w:rPr>
                 <w:color w:val="833C0B" w:themeColor="accent2" w:themeShade="80"/>
+                <w:sz w:val="28"/>
+                <w:szCs w:val="28"/>
                 <w:lang w:val="sr-Latn-RS"/>
               </w:rPr>
             </w:pPr>
             <w:r>
               <w:rPr>
                 <w:color w:val="833C0B" w:themeColor="accent2" w:themeShade="80"/>
+                <w:sz w:val="28"/>
+                <w:szCs w:val="28"/>
                 <w:lang w:val="sr-Latn-RS"/>
               </w:rPr>
               <w:t>seiner - njegov</w:t>
@@ -14659,12 +14732,16 @@
               <w:pStyle w:val="NoSpacing"/>
               <w:rPr>
                 <w:color w:val="C00000"/>
+                <w:sz w:val="28"/>
+                <w:szCs w:val="28"/>
                 <w:lang w:val="sr-Latn-RS"/>
               </w:rPr>
             </w:pPr>
             <w:r>
               <w:rPr>
                 <w:color w:val="C00000"/>
+                <w:sz w:val="28"/>
+                <w:szCs w:val="28"/>
                 <w:lang w:val="sr-Latn-RS"/>
               </w:rPr>
               <w:t>ihm - njemu</w:t>
@@ -14686,11 +14763,15 @@
             <w:pPr>
               <w:pStyle w:val="NoSpacing"/>
               <w:rPr>
-                <w:lang w:val="sr-Latn-RS"/>
-              </w:rPr>
-            </w:pPr>
-            <w:r>
-              <w:rPr>
+                <w:sz w:val="28"/>
+                <w:szCs w:val="28"/>
+                <w:lang w:val="sr-Latn-RS"/>
+              </w:rPr>
+            </w:pPr>
+            <w:r>
+              <w:rPr>
+                <w:sz w:val="28"/>
+                <w:szCs w:val="28"/>
                 <w:lang w:val="sr-Latn-RS"/>
               </w:rPr>
               <w:t>es - njega</w:t>
@@ -14715,12 +14796,16 @@
               <w:pStyle w:val="NoSpacing"/>
               <w:rPr>
                 <w:color w:val="385623" w:themeColor="accent6" w:themeShade="80"/>
+                <w:sz w:val="28"/>
+                <w:szCs w:val="28"/>
                 <w:lang w:val="sr-Latn-RS"/>
               </w:rPr>
             </w:pPr>
             <w:r>
               <w:rPr>
                 <w:color w:val="385623" w:themeColor="accent6" w:themeShade="80"/>
+                <w:sz w:val="28"/>
+                <w:szCs w:val="28"/>
                 <w:lang w:val="sr-Latn-RS"/>
               </w:rPr>
               <w:t>wir</w:t>
@@ -14743,12 +14828,16 @@
               <w:pStyle w:val="NoSpacing"/>
               <w:rPr>
                 <w:color w:val="833C0B" w:themeColor="accent2" w:themeShade="80"/>
+                <w:sz w:val="28"/>
+                <w:szCs w:val="28"/>
                 <w:lang w:val="sr-Latn-RS"/>
               </w:rPr>
             </w:pPr>
             <w:r>
               <w:rPr>
                 <w:color w:val="833C0B" w:themeColor="accent2" w:themeShade="80"/>
+                <w:sz w:val="28"/>
+                <w:szCs w:val="28"/>
                 <w:lang w:val="sr-Latn-RS"/>
               </w:rPr>
               <w:t>unser - naš</w:t>
@@ -14771,12 +14860,16 @@
               <w:pStyle w:val="NoSpacing"/>
               <w:rPr>
                 <w:color w:val="C00000"/>
+                <w:sz w:val="28"/>
+                <w:szCs w:val="28"/>
                 <w:lang w:val="sr-Latn-RS"/>
               </w:rPr>
             </w:pPr>
             <w:r>
               <w:rPr>
                 <w:color w:val="C00000"/>
+                <w:sz w:val="28"/>
+                <w:szCs w:val="28"/>
                 <w:lang w:val="sr-Latn-RS"/>
               </w:rPr>
               <w:t>uns - nama</w:t>
@@ -14798,11 +14891,15 @@
             <w:pPr>
               <w:pStyle w:val="NoSpacing"/>
               <w:rPr>
-                <w:lang w:val="sr-Latn-RS"/>
-              </w:rPr>
-            </w:pPr>
-            <w:r>
-              <w:rPr>
+                <w:sz w:val="28"/>
+                <w:szCs w:val="28"/>
+                <w:lang w:val="sr-Latn-RS"/>
+              </w:rPr>
+            </w:pPr>
+            <w:r>
+              <w:rPr>
+                <w:sz w:val="28"/>
+                <w:szCs w:val="28"/>
                 <w:lang w:val="sr-Latn-RS"/>
               </w:rPr>
               <w:t>uns - nas</w:t>
@@ -14827,12 +14924,16 @@
               <w:pStyle w:val="NoSpacing"/>
               <w:rPr>
                 <w:color w:val="385623" w:themeColor="accent6" w:themeShade="80"/>
+                <w:sz w:val="28"/>
+                <w:szCs w:val="28"/>
                 <w:lang w:val="sr-Latn-RS"/>
               </w:rPr>
             </w:pPr>
             <w:r>
               <w:rPr>
                 <w:color w:val="385623" w:themeColor="accent6" w:themeShade="80"/>
+                <w:sz w:val="28"/>
+                <w:szCs w:val="28"/>
                 <w:lang w:val="sr-Latn-RS"/>
               </w:rPr>
               <w:t>ihr</w:t>
@@ -14855,12 +14956,16 @@
               <w:pStyle w:val="NoSpacing"/>
               <w:rPr>
                 <w:color w:val="833C0B" w:themeColor="accent2" w:themeShade="80"/>
+                <w:sz w:val="28"/>
+                <w:szCs w:val="28"/>
                 <w:lang w:val="sr-Latn-RS"/>
               </w:rPr>
             </w:pPr>
             <w:r>
               <w:rPr>
                 <w:color w:val="833C0B" w:themeColor="accent2" w:themeShade="80"/>
+                <w:sz w:val="28"/>
+                <w:szCs w:val="28"/>
                 <w:lang w:val="sr-Latn-RS"/>
               </w:rPr>
               <w:t>euer - vaš</w:t>
@@ -14883,12 +14988,16 @@
               <w:pStyle w:val="NoSpacing"/>
               <w:rPr>
                 <w:color w:val="C00000"/>
+                <w:sz w:val="28"/>
+                <w:szCs w:val="28"/>
                 <w:lang w:val="sr-Latn-RS"/>
               </w:rPr>
             </w:pPr>
             <w:r>
               <w:rPr>
                 <w:color w:val="C00000"/>
+                <w:sz w:val="28"/>
+                <w:szCs w:val="28"/>
                 <w:lang w:val="sr-Latn-RS"/>
               </w:rPr>
               <w:t>euch - vama</w:t>
@@ -14910,11 +15019,15 @@
             <w:pPr>
               <w:pStyle w:val="NoSpacing"/>
               <w:rPr>
-                <w:lang w:val="sr-Latn-RS"/>
-              </w:rPr>
-            </w:pPr>
-            <w:r>
-              <w:rPr>
+                <w:sz w:val="28"/>
+                <w:szCs w:val="28"/>
+                <w:lang w:val="sr-Latn-RS"/>
+              </w:rPr>
+            </w:pPr>
+            <w:r>
+              <w:rPr>
+                <w:sz w:val="28"/>
+                <w:szCs w:val="28"/>
                 <w:lang w:val="sr-Latn-RS"/>
               </w:rPr>
               <w:t>euch - vas</w:t>
@@ -14939,12 +15052,16 @@
               <w:pStyle w:val="NoSpacing"/>
               <w:rPr>
                 <w:color w:val="385623" w:themeColor="accent6" w:themeShade="80"/>
+                <w:sz w:val="28"/>
+                <w:szCs w:val="28"/>
                 <w:lang w:val="sr-Latn-RS"/>
               </w:rPr>
             </w:pPr>
             <w:r>
               <w:rPr>
                 <w:color w:val="385623" w:themeColor="accent6" w:themeShade="80"/>
+                <w:sz w:val="28"/>
+                <w:szCs w:val="28"/>
                 <w:lang w:val="sr-Latn-RS"/>
               </w:rPr>
               <w:t>Sie, sie</w:t>
@@ -14967,12 +15084,16 @@
               <w:pStyle w:val="NoSpacing"/>
               <w:rPr>
                 <w:color w:val="833C0B" w:themeColor="accent2" w:themeShade="80"/>
+                <w:sz w:val="28"/>
+                <w:szCs w:val="28"/>
                 <w:lang w:val="sr-Latn-RS"/>
               </w:rPr>
             </w:pPr>
             <w:r>
               <w:rPr>
                 <w:color w:val="833C0B" w:themeColor="accent2" w:themeShade="80"/>
+                <w:sz w:val="28"/>
+                <w:szCs w:val="28"/>
                 <w:lang w:val="sr-Latn-RS"/>
               </w:rPr>
               <w:t>Ihrer, ihrer – Vaš, njihovo</w:t>
@@ -14995,12 +15116,16 @@
               <w:pStyle w:val="NoSpacing"/>
               <w:rPr>
                 <w:color w:val="C00000"/>
+                <w:sz w:val="28"/>
+                <w:szCs w:val="28"/>
                 <w:lang w:val="sr-Latn-RS"/>
               </w:rPr>
             </w:pPr>
             <w:r>
               <w:rPr>
                 <w:color w:val="C00000"/>
+                <w:sz w:val="28"/>
+                <w:szCs w:val="28"/>
                 <w:lang w:val="sr-Latn-RS"/>
               </w:rPr>
               <w:t>Ihnen, ihnen – Vama, njima</w:t>
@@ -15022,11 +15147,15 @@
             <w:pPr>
               <w:pStyle w:val="NoSpacing"/>
               <w:rPr>
-                <w:lang w:val="sr-Latn-RS"/>
-              </w:rPr>
-            </w:pPr>
-            <w:r>
-              <w:rPr>
+                <w:sz w:val="28"/>
+                <w:szCs w:val="28"/>
+                <w:lang w:val="sr-Latn-RS"/>
+              </w:rPr>
+            </w:pPr>
+            <w:r>
+              <w:rPr>
+                <w:sz w:val="28"/>
+                <w:szCs w:val="28"/>
                 <w:lang w:val="sr-Latn-RS"/>
               </w:rPr>
               <w:t>Sie, sie – Vas, njih</w:t>
@@ -15498,6 +15627,7 @@
         <w:rPr>
           <w:lang w:val="de-DE"/>
         </w:rPr>
+        <w:lastRenderedPageBreak/>
         <w:t>ihr kämmt euch</w:t>
       </w:r>
     </w:p>
@@ -15526,7 +15656,6 @@
         <w:rPr>
           <w:lang w:val="sr-Latn-RS"/>
         </w:rPr>
-        <w:lastRenderedPageBreak/>
         <w:t>Sich freuen – radovati se (ich freue mich, du freust dich, er/sie/es freut sich, wir freuen uns...)</w:t>
       </w:r>
     </w:p>
@@ -16164,6 +16293,7 @@
         <w:rPr>
           <w:lang w:val="sr-Latn-RS"/>
         </w:rPr>
+        <w:lastRenderedPageBreak/>
         <w:t>Sie, sie machen aus</w:t>
       </w:r>
     </w:p>
@@ -16178,7 +16308,6 @@
         <w:rPr>
           <w:lang w:val="sr-Latn-RS"/>
         </w:rPr>
-        <w:lastRenderedPageBreak/>
         <w:t>ich mache das Licht (svetlo) aus – gasim svetlo                   dunkel-tamno, hell-svetlo</w:t>
       </w:r>
     </w:p>

</xml_diff>